<commit_message>
feat: links hub apontam para .docx + prototipo html + nomes atualizados
</commit_message>
<xml_diff>
--- a/disciplinas/gcetens843-projeto-algoritmo-i/atividades/trabalhos/projeto-algoritmos/fluxograma.docx
+++ b/disciplinas/gcetens843-projeto-algoritmo-i/atividades/trabalhos/projeto-algoritmos/fluxograma.docx
@@ -2,7 +2,7 @@
 <file path=word/document.xml><?xml version="1.0" encoding="utf-8"?>
 <w:document xmlns:w="http://schemas.openxmlformats.org/wordprocessingml/2006/main" xmlns:m="http://schemas.openxmlformats.org/officeDocument/2006/math" xmlns:r="http://schemas.openxmlformats.org/officeDocument/2006/relationships" xmlns:o="urn:schemas-microsoft-com:office:office" xmlns:v="urn:schemas-microsoft-com:vml" xmlns:w10="urn:schemas-microsoft-com:office:word" xmlns:a="http://schemas.openxmlformats.org/drawingml/2006/main" xmlns:pic="http://schemas.openxmlformats.org/drawingml/2006/picture" xmlns:wp="http://schemas.openxmlformats.org/drawingml/2006/wordprocessingDrawing">
   <w:body>
-    <w:bookmarkStart w:id="32" w:name="fluxograma-do-sistema-minhafila"/>
+    <w:bookmarkStart w:id="35" w:name="fluxograma-do-sistema-minhafila"/>
     <w:p>
       <w:pPr>
         <w:pStyle w:val="Heading1"/>
@@ -89,7 +89,7 @@
         </w:pict>
       </w:r>
     </w:p>
-    <w:bookmarkStart w:id="21" w:name="fluxograma-completo"/>
+    <w:bookmarkStart w:id="24" w:name="fluxograma-completo"/>
     <w:p>
       <w:pPr>
         <w:pStyle w:val="Heading2"/>
@@ -98,31 +98,53 @@
         <w:t xml:space="preserve">🖼️ Fluxograma Completo</w:t>
       </w:r>
     </w:p>
-    <w:tbl>
-      <w:tblPr>
-        <w:tblStyle w:val="FigureTable"/>
-        <w:tblW w:type="auto" w:w="0"/>
-        <w:jc w:val="center"/>
-        <w:tblLook w:firstRow="0" w:lastRow="0" w:firstColumn="0" w:lastColumn="0"/>
-      </w:tblPr>
-      <w:tblGrid>
-        <w:gridCol w:w="7920"/>
-      </w:tblGrid>
-      <w:tr>
-        <w:tc>
-          <w:tcPr/>
-          <w:p>
-            <w:pPr>
-              <w:pStyle w:val="Compact"/>
-              <w:jc w:val="center"/>
-            </w:pPr>
-            <w:r>
-              <w:t xml:space="preserve">Fluxograma MinhaFila</w:t>
-            </w:r>
-          </w:p>
-        </w:tc>
-      </w:tr>
-    </w:tbl>
+    <w:p>
+      <w:pPr>
+        <w:pStyle w:val="CaptionedFigure"/>
+      </w:pPr>
+      <w:r>
+        <w:drawing>
+          <wp:inline>
+            <wp:extent cx="5334000" cy="11272271"/>
+            <wp:effectExtent b="0" l="0" r="0" t="0"/>
+            <wp:docPr descr="Fluxograma MinhaFila" title="" id="22" name="Picture"/>
+            <a:graphic>
+              <a:graphicData uri="http://schemas.openxmlformats.org/drawingml/2006/picture">
+                <pic:pic>
+                  <pic:nvPicPr>
+                    <pic:cNvPr descr="assets/fluxograma.jpeg" id="23" name="Picture"/>
+                    <pic:cNvPicPr>
+                      <a:picLocks noChangeArrowheads="1" noChangeAspect="1"/>
+                    </pic:cNvPicPr>
+                  </pic:nvPicPr>
+                  <pic:blipFill>
+                    <a:blip r:embed="rId21"/>
+                    <a:stretch>
+                      <a:fillRect/>
+                    </a:stretch>
+                  </pic:blipFill>
+                  <pic:spPr bwMode="auto">
+                    <a:xfrm>
+                      <a:off x="0" y="0"/>
+                      <a:ext cx="5334000" cy="11272271"/>
+                    </a:xfrm>
+                    <a:prstGeom prst="rect">
+                      <a:avLst/>
+                    </a:prstGeom>
+                    <a:noFill/>
+                    <a:ln w="9525">
+                      <a:noFill/>
+                      <a:headEnd/>
+                      <a:tailEnd/>
+                    </a:ln>
+                  </pic:spPr>
+                </pic:pic>
+              </a:graphicData>
+            </a:graphic>
+          </wp:inline>
+        </w:drawing>
+      </w:r>
+    </w:p>
     <w:p>
       <w:pPr>
         <w:pStyle w:val="ImageCaption"/>
@@ -150,8 +172,8 @@
         </w:pict>
       </w:r>
     </w:p>
-    <w:bookmarkEnd w:id="21"/>
-    <w:bookmarkStart w:id="31" w:name="detalhamento-de-cada-etapa"/>
+    <w:bookmarkEnd w:id="24"/>
+    <w:bookmarkStart w:id="34" w:name="detalhamento-de-cada-etapa"/>
     <w:p>
       <w:pPr>
         <w:pStyle w:val="Heading2"/>
@@ -160,7 +182,7 @@
         <w:t xml:space="preserve">🔍 Detalhamento de Cada Etapa</w:t>
       </w:r>
     </w:p>
-    <w:bookmarkStart w:id="22" w:name="entrada-no-sistema"/>
+    <w:bookmarkStart w:id="25" w:name="entrada-no-sistema"/>
     <w:p>
       <w:pPr>
         <w:pStyle w:val="Heading3"/>
@@ -205,8 +227,8 @@
         <w:t xml:space="preserve">Se não tem → realiza cadastro rápido</w:t>
       </w:r>
     </w:p>
-    <w:bookmarkEnd w:id="22"/>
-    <w:bookmarkStart w:id="23" w:name="solicitação-de-atendimento"/>
+    <w:bookmarkEnd w:id="25"/>
+    <w:bookmarkStart w:id="26" w:name="solicitação-de-atendimento"/>
     <w:p>
       <w:pPr>
         <w:pStyle w:val="Heading3"/>
@@ -239,8 +261,8 @@
         <w:t xml:space="preserve">Seleciona o tipo de serviço (atendimento comum, prioritário, retorno, informação)</w:t>
       </w:r>
     </w:p>
-    <w:bookmarkEnd w:id="23"/>
-    <w:bookmarkStart w:id="24" w:name="decisão-é-prioridade"/>
+    <w:bookmarkEnd w:id="26"/>
+    <w:bookmarkStart w:id="27" w:name="decisão-é-prioridade"/>
     <w:p>
       <w:pPr>
         <w:pStyle w:val="Heading3"/>
@@ -331,8 +353,8 @@
         <w:t xml:space="preserve">Ambas as filas seguem o mesmo fluxo a partir daqui</w:t>
       </w:r>
     </w:p>
-    <w:bookmarkEnd w:id="24"/>
-    <w:bookmarkStart w:id="25" w:name="geração-de-senha"/>
+    <w:bookmarkEnd w:id="27"/>
+    <w:bookmarkStart w:id="28" w:name="geração-de-senha"/>
     <w:p>
       <w:pPr>
         <w:pStyle w:val="Heading3"/>
@@ -413,8 +435,8 @@
         <w:t xml:space="preserve">Calcula previsão inicial de atendimento</w:t>
       </w:r>
     </w:p>
-    <w:bookmarkEnd w:id="25"/>
-    <w:bookmarkStart w:id="26" w:name="chamada-e-notificação"/>
+    <w:bookmarkEnd w:id="28"/>
+    <w:bookmarkStart w:id="29" w:name="chamada-e-notificação"/>
     <w:p>
       <w:pPr>
         <w:pStyle w:val="Heading3"/>
@@ -459,8 +481,8 @@
         <w:t xml:space="preserve">Sistema exibe o tempo médio de atendimento em tempo real</w:t>
       </w:r>
     </w:p>
-    <w:bookmarkEnd w:id="26"/>
-    <w:bookmarkStart w:id="27" w:name="atendimento-e-finalização"/>
+    <w:bookmarkEnd w:id="29"/>
+    <w:bookmarkStart w:id="30" w:name="atendimento-e-finalização"/>
     <w:p>
       <w:pPr>
         <w:pStyle w:val="Heading3"/>
@@ -517,8 +539,8 @@
         <w:t xml:space="preserve">Próximo usuário no topo é chamado</w:t>
       </w:r>
     </w:p>
-    <w:bookmarkEnd w:id="27"/>
-    <w:bookmarkStart w:id="28" w:name="retorno-feedback-loop"/>
+    <w:bookmarkEnd w:id="30"/>
+    <w:bookmarkStart w:id="31" w:name="retorno-feedback-loop"/>
     <w:p>
       <w:pPr>
         <w:pStyle w:val="Heading3"/>
@@ -595,8 +617,8 @@
         <w:t xml:space="preserve">O fluxo reinicia a partir da etapa de escolha do tipo de atendimento</w:t>
       </w:r>
     </w:p>
-    <w:bookmarkEnd w:id="28"/>
-    <w:bookmarkStart w:id="30" w:name="funcionalidades-do-sistema"/>
+    <w:bookmarkEnd w:id="31"/>
+    <w:bookmarkStart w:id="33" w:name="funcionalidades-do-sistema"/>
     <w:p>
       <w:pPr>
         <w:pStyle w:val="Heading3"/>
@@ -718,7 +740,7 @@
       <w:r>
         <w:t xml:space="preserve"> </w:t>
       </w:r>
-      <w:hyperlink r:id="rId29">
+      <w:hyperlink r:id="rId32">
         <w:r>
           <w:rPr>
             <w:rStyle w:val="Hyperlink"/>
@@ -727,10 +749,14 @@
         </w:r>
       </w:hyperlink>
     </w:p>
-    <w:bookmarkEnd w:id="30"/>
-    <w:bookmarkEnd w:id="31"/>
-    <w:bookmarkEnd w:id="32"/>
-    <w:sectPr/>
+    <w:bookmarkEnd w:id="33"/>
+    <w:bookmarkEnd w:id="34"/>
+    <w:bookmarkEnd w:id="35"/>
+    <w:sectPr>
+      <w:footnotePr>
+        <w:numRestart w:val="eachSect"/>
+      </w:footnotePr>
+    </w:sectPr>
   </w:body>
 </w:document>
 </file>

</xml_diff>

<commit_message>
fix: .docx regenerados do zero - header ufrb limpo sem duplicacoes
</commit_message>
<xml_diff>
--- a/disciplinas/gcetens843-projeto-algoritmo-i/atividades/trabalhos/projeto-algoritmos/fluxograma.docx
+++ b/disciplinas/gcetens843-projeto-algoritmo-i/atividades/trabalhos/projeto-algoritmos/fluxograma.docx
@@ -2,7 +2,7 @@
 <file path=word/document.xml><?xml version="1.0" encoding="utf-8"?>
 <w:document xmlns:w="http://schemas.openxmlformats.org/wordprocessingml/2006/main" xmlns:m="http://schemas.openxmlformats.org/officeDocument/2006/math" xmlns:r="http://schemas.openxmlformats.org/officeDocument/2006/relationships" xmlns:o="urn:schemas-microsoft-com:office:office" xmlns:v="urn:schemas-microsoft-com:vml" xmlns:w10="urn:schemas-microsoft-com:office:word" xmlns:a="http://schemas.openxmlformats.org/drawingml/2006/main" xmlns:pic="http://schemas.openxmlformats.org/drawingml/2006/picture" xmlns:wp="http://schemas.openxmlformats.org/drawingml/2006/wordprocessingDrawing">
   <w:body>
-    <w:bookmarkStart w:id="35" w:name="fluxograma-do-sistema-minhafila"/>
+    <w:bookmarkStart w:id="32" w:name="fluxograma-do-sistema-minhafila"/>
     <w:p>
       <w:pPr>
         <w:pStyle w:val="Heading1"/>
@@ -89,7 +89,7 @@
         </w:pict>
       </w:r>
     </w:p>
-    <w:bookmarkStart w:id="24" w:name="fluxograma-completo"/>
+    <w:bookmarkStart w:id="21" w:name="fluxograma-completo"/>
     <w:p>
       <w:pPr>
         <w:pStyle w:val="Heading2"/>
@@ -98,53 +98,31 @@
         <w:t xml:space="preserve">🖼️ Fluxograma Completo</w:t>
       </w:r>
     </w:p>
-    <w:p>
-      <w:pPr>
-        <w:pStyle w:val="CaptionedFigure"/>
-      </w:pPr>
-      <w:r>
-        <w:drawing>
-          <wp:inline>
-            <wp:extent cx="5334000" cy="11272271"/>
-            <wp:effectExtent b="0" l="0" r="0" t="0"/>
-            <wp:docPr descr="Fluxograma MinhaFila" title="" id="22" name="Picture"/>
-            <a:graphic>
-              <a:graphicData uri="http://schemas.openxmlformats.org/drawingml/2006/picture">
-                <pic:pic>
-                  <pic:nvPicPr>
-                    <pic:cNvPr descr="assets/fluxograma.jpeg" id="23" name="Picture"/>
-                    <pic:cNvPicPr>
-                      <a:picLocks noChangeArrowheads="1" noChangeAspect="1"/>
-                    </pic:cNvPicPr>
-                  </pic:nvPicPr>
-                  <pic:blipFill>
-                    <a:blip r:embed="rId21"/>
-                    <a:stretch>
-                      <a:fillRect/>
-                    </a:stretch>
-                  </pic:blipFill>
-                  <pic:spPr bwMode="auto">
-                    <a:xfrm>
-                      <a:off x="0" y="0"/>
-                      <a:ext cx="5334000" cy="11272271"/>
-                    </a:xfrm>
-                    <a:prstGeom prst="rect">
-                      <a:avLst/>
-                    </a:prstGeom>
-                    <a:noFill/>
-                    <a:ln w="9525">
-                      <a:noFill/>
-                      <a:headEnd/>
-                      <a:tailEnd/>
-                    </a:ln>
-                  </pic:spPr>
-                </pic:pic>
-              </a:graphicData>
-            </a:graphic>
-          </wp:inline>
-        </w:drawing>
-      </w:r>
-    </w:p>
+    <w:tbl>
+      <w:tblPr>
+        <w:tblStyle w:val="FigureTable"/>
+        <w:tblW w:type="auto" w:w="0"/>
+        <w:jc w:val="center"/>
+        <w:tblLook w:firstRow="0" w:lastRow="0" w:firstColumn="0" w:lastColumn="0"/>
+      </w:tblPr>
+      <w:tblGrid>
+        <w:gridCol w:w="7920"/>
+      </w:tblGrid>
+      <w:tr>
+        <w:tc>
+          <w:tcPr/>
+          <w:p>
+            <w:pPr>
+              <w:pStyle w:val="Compact"/>
+              <w:jc w:val="center"/>
+            </w:pPr>
+            <w:r>
+              <w:t xml:space="preserve">Fluxograma MinhaFila</w:t>
+            </w:r>
+          </w:p>
+        </w:tc>
+      </w:tr>
+    </w:tbl>
     <w:p>
       <w:pPr>
         <w:pStyle w:val="ImageCaption"/>
@@ -172,8 +150,8 @@
         </w:pict>
       </w:r>
     </w:p>
-    <w:bookmarkEnd w:id="24"/>
-    <w:bookmarkStart w:id="34" w:name="detalhamento-de-cada-etapa"/>
+    <w:bookmarkEnd w:id="21"/>
+    <w:bookmarkStart w:id="31" w:name="detalhamento-de-cada-etapa"/>
     <w:p>
       <w:pPr>
         <w:pStyle w:val="Heading2"/>
@@ -182,7 +160,7 @@
         <w:t xml:space="preserve">🔍 Detalhamento de Cada Etapa</w:t>
       </w:r>
     </w:p>
-    <w:bookmarkStart w:id="25" w:name="entrada-no-sistema"/>
+    <w:bookmarkStart w:id="22" w:name="entrada-no-sistema"/>
     <w:p>
       <w:pPr>
         <w:pStyle w:val="Heading3"/>
@@ -227,8 +205,8 @@
         <w:t xml:space="preserve">Se não tem → realiza cadastro rápido</w:t>
       </w:r>
     </w:p>
-    <w:bookmarkEnd w:id="25"/>
-    <w:bookmarkStart w:id="26" w:name="solicitação-de-atendimento"/>
+    <w:bookmarkEnd w:id="22"/>
+    <w:bookmarkStart w:id="23" w:name="solicitação-de-atendimento"/>
     <w:p>
       <w:pPr>
         <w:pStyle w:val="Heading3"/>
@@ -261,8 +239,8 @@
         <w:t xml:space="preserve">Seleciona o tipo de serviço (atendimento comum, prioritário, retorno, informação)</w:t>
       </w:r>
     </w:p>
-    <w:bookmarkEnd w:id="26"/>
-    <w:bookmarkStart w:id="27" w:name="decisão-é-prioridade"/>
+    <w:bookmarkEnd w:id="23"/>
+    <w:bookmarkStart w:id="24" w:name="decisão-é-prioridade"/>
     <w:p>
       <w:pPr>
         <w:pStyle w:val="Heading3"/>
@@ -353,8 +331,8 @@
         <w:t xml:space="preserve">Ambas as filas seguem o mesmo fluxo a partir daqui</w:t>
       </w:r>
     </w:p>
-    <w:bookmarkEnd w:id="27"/>
-    <w:bookmarkStart w:id="28" w:name="geração-de-senha"/>
+    <w:bookmarkEnd w:id="24"/>
+    <w:bookmarkStart w:id="25" w:name="geração-de-senha"/>
     <w:p>
       <w:pPr>
         <w:pStyle w:val="Heading3"/>
@@ -435,8 +413,8 @@
         <w:t xml:space="preserve">Calcula previsão inicial de atendimento</w:t>
       </w:r>
     </w:p>
-    <w:bookmarkEnd w:id="28"/>
-    <w:bookmarkStart w:id="29" w:name="chamada-e-notificação"/>
+    <w:bookmarkEnd w:id="25"/>
+    <w:bookmarkStart w:id="26" w:name="chamada-e-notificação"/>
     <w:p>
       <w:pPr>
         <w:pStyle w:val="Heading3"/>
@@ -481,8 +459,8 @@
         <w:t xml:space="preserve">Sistema exibe o tempo médio de atendimento em tempo real</w:t>
       </w:r>
     </w:p>
-    <w:bookmarkEnd w:id="29"/>
-    <w:bookmarkStart w:id="30" w:name="atendimento-e-finalização"/>
+    <w:bookmarkEnd w:id="26"/>
+    <w:bookmarkStart w:id="27" w:name="atendimento-e-finalização"/>
     <w:p>
       <w:pPr>
         <w:pStyle w:val="Heading3"/>
@@ -539,8 +517,8 @@
         <w:t xml:space="preserve">Próximo usuário no topo é chamado</w:t>
       </w:r>
     </w:p>
-    <w:bookmarkEnd w:id="30"/>
-    <w:bookmarkStart w:id="31" w:name="retorno-feedback-loop"/>
+    <w:bookmarkEnd w:id="27"/>
+    <w:bookmarkStart w:id="28" w:name="retorno-feedback-loop"/>
     <w:p>
       <w:pPr>
         <w:pStyle w:val="Heading3"/>
@@ -617,8 +595,8 @@
         <w:t xml:space="preserve">O fluxo reinicia a partir da etapa de escolha do tipo de atendimento</w:t>
       </w:r>
     </w:p>
-    <w:bookmarkEnd w:id="31"/>
-    <w:bookmarkStart w:id="33" w:name="funcionalidades-do-sistema"/>
+    <w:bookmarkEnd w:id="28"/>
+    <w:bookmarkStart w:id="30" w:name="funcionalidades-do-sistema"/>
     <w:p>
       <w:pPr>
         <w:pStyle w:val="Heading3"/>
@@ -740,7 +718,7 @@
       <w:r>
         <w:t xml:space="preserve"> </w:t>
       </w:r>
-      <w:hyperlink r:id="rId32">
+      <w:hyperlink r:id="rId29">
         <w:r>
           <w:rPr>
             <w:rStyle w:val="Hyperlink"/>
@@ -749,16 +727,15 @@
         </w:r>
       </w:hyperlink>
     </w:p>
-    <w:bookmarkEnd w:id="33"/>
-    <w:bookmarkEnd w:id="34"/>
-    <w:bookmarkEnd w:id="35"/>
+    <w:bookmarkEnd w:id="30"/>
+    <w:bookmarkEnd w:id="31"/>
+    <w:bookmarkEnd w:id="32"/>
     <w:sectPr>
       <w:headerReference w:type="default" r:id="rId9"/>
       <w:footerReference w:type="default" r:id="rId10"/>
       <w:footnotePr>
         <w:numRestart w:val="eachSect"/>
       </w:footnotePr>
-      <w:pgMar w:top="1728" w:bottom="1440" w:left="1440" w:right="1440"/>
     </w:sectPr>
   </w:body>
 </w:document>
@@ -775,15 +752,6 @@
       <w:pStyle w:val="Footer"/>
       <w:jc w:val="center"/>
     </w:pPr>
-    <w:r>
-      <w:rPr>
-        <w:rFonts w:ascii="Times New Roman" w:hAnsi="Times New Roman"/>
-        <w:i/>
-        <w:color w:val="505050"/>
-        <w:sz w:val="14"/>
-      </w:rPr>
-      <w:t>MinhaFila — GCETENS843 — 2026.1</w:t>
-    </w:r>
     <w:r>
       <w:rPr>
         <w:rFonts w:ascii="Times New Roman" w:hAnsi="Times New Roman"/>
@@ -826,7 +794,14 @@
   <w:tbl>
     <w:tblPr>
       <w:tblW w:type="auto" w:w="0"/>
+      <w:tblLayout w:type="autofit"/>
       <w:tblLook w:firstColumn="1" w:firstRow="1" w:lastColumn="0" w:lastRow="0" w:noHBand="0" w:noVBand="1" w:val="04A0"/>
+      <w:tblBorders>
+        <w:top w:val="none" w:sz="0" w:space="0" w:color="auto"/>
+        <w:left w:val="none" w:sz="0" w:space="0" w:color="auto"/>
+        <w:bottom w:val="none" w:sz="0" w:space="0" w:color="auto"/>
+        <w:right w:val="none" w:sz="0" w:space="0" w:color="auto"/>
+      </w:tblBorders>
     </w:tblPr>
     <w:tblGrid>
       <w:gridCol w:w="4680"/>
@@ -836,12 +811,6 @@
       <w:tc>
         <w:tcPr>
           <w:tcW w:type="dxa" w:w="2016"/>
-          <w:tcBorders>
-            <w:top w:val="none" w:sz="0" w:space="0" w:color="auto"/>
-            <w:left w:val="none" w:sz="0" w:space="0" w:color="auto"/>
-            <w:bottom w:val="none" w:sz="0" w:space="0" w:color="auto"/>
-            <w:right w:val="none" w:sz="0" w:space="0" w:color="auto"/>
-          </w:tcBorders>
         </w:tcPr>
         <w:p>
           <w:pPr>
@@ -850,7 +819,7 @@
           <w:r>
             <w:drawing>
               <wp:inline xmlns:a="http://schemas.openxmlformats.org/drawingml/2006/main" xmlns:pic="http://schemas.openxmlformats.org/drawingml/2006/picture">
-                <wp:extent cx="1188720" cy="468220"/>
+                <wp:extent cx="1143000" cy="450211"/>
                 <wp:docPr id="1" name="Picture 1"/>
                 <wp:cNvGraphicFramePr>
                   <a:graphicFrameLocks noChangeAspect="1"/>
@@ -871,7 +840,7 @@
                       <pic:spPr>
                         <a:xfrm>
                           <a:off x="0" y="0"/>
-                          <a:ext cx="1188720" cy="468220"/>
+                          <a:ext cx="1143000" cy="450211"/>
                         </a:xfrm>
                         <a:prstGeom prst="rect"/>
                       </pic:spPr>
@@ -886,12 +855,6 @@
       <w:tc>
         <w:tcPr>
           <w:tcW w:type="dxa" w:w="7200"/>
-          <w:tcBorders>
-            <w:top w:val="none" w:sz="0" w:space="0" w:color="auto"/>
-            <w:left w:val="none" w:sz="0" w:space="0" w:color="auto"/>
-            <w:bottom w:val="none" w:sz="0" w:space="0" w:color="auto"/>
-            <w:right w:val="none" w:sz="0" w:space="0" w:color="auto"/>
-          </w:tcBorders>
         </w:tcPr>
         <w:p>
           <w:pPr>
@@ -928,6 +891,7 @@
           <w:r>
             <w:rPr>
               <w:rFonts w:ascii="Times New Roman" w:hAnsi="Times New Roman"/>
+              <w:b w:val="0"/>
               <w:color w:val="505050"/>
               <w:sz w:val="14"/>
             </w:rPr>
@@ -940,132 +904,8 @@
           </w:pPr>
           <w:r>
             <w:rPr>
-              <w:color w:val="C89B3C"/>
-              <w:sz w:val="8"/>
-            </w:rPr>
-            <w:t>────────────────────────────────────────────────────────────────────────────────</w:t>
-          </w:r>
-        </w:p>
-      </w:tc>
-    </w:tr>
-  </w:tbl>
-  <w:tbl>
-    <w:tblPr>
-      <w:tblW w:type="auto" w:w="0"/>
-      <w:tblLook w:firstColumn="1" w:firstRow="1" w:lastColumn="0" w:lastRow="0" w:noHBand="0" w:noVBand="1" w:val="04A0"/>
-    </w:tblPr>
-    <w:tblGrid>
-      <w:gridCol w:w="4680"/>
-      <w:gridCol w:w="4680"/>
-    </w:tblGrid>
-    <w:tr>
-      <w:tc>
-        <w:tcPr>
-          <w:tcW w:type="dxa" w:w="2016"/>
-          <w:tcBorders>
-            <w:top w:val="none" w:sz="0" w:space="0" w:color="auto"/>
-            <w:left w:val="none" w:sz="0" w:space="0" w:color="auto"/>
-            <w:bottom w:val="none" w:sz="0" w:space="0" w:color="auto"/>
-            <w:right w:val="none" w:sz="0" w:space="0" w:color="auto"/>
-          </w:tcBorders>
-        </w:tcPr>
-        <w:p>
-          <w:pPr>
-            <w:jc w:val="left"/>
-          </w:pPr>
-          <w:r>
-            <w:drawing>
-              <wp:inline xmlns:a="http://schemas.openxmlformats.org/drawingml/2006/main" xmlns:pic="http://schemas.openxmlformats.org/drawingml/2006/picture">
-                <wp:extent cx="1188720" cy="468220"/>
-                <wp:docPr id="2" name="Picture 2"/>
-                <wp:cNvGraphicFramePr>
-                  <a:graphicFrameLocks noChangeAspect="1"/>
-                </wp:cNvGraphicFramePr>
-                <a:graphic>
-                  <a:graphicData uri="http://schemas.openxmlformats.org/drawingml/2006/picture">
-                    <pic:pic>
-                      <pic:nvPicPr>
-                        <pic:cNvPr id="0" name="image.png"/>
-                        <pic:cNvPicPr/>
-                      </pic:nvPicPr>
-                      <pic:blipFill>
-                        <a:blip r:embed="rId1"/>
-                        <a:stretch>
-                          <a:fillRect/>
-                        </a:stretch>
-                      </pic:blipFill>
-                      <pic:spPr>
-                        <a:xfrm>
-                          <a:off x="0" y="0"/>
-                          <a:ext cx="1188720" cy="468220"/>
-                        </a:xfrm>
-                        <a:prstGeom prst="rect"/>
-                      </pic:spPr>
-                    </pic:pic>
-                  </a:graphicData>
-                </a:graphic>
-              </wp:inline>
-            </w:drawing>
-          </w:r>
-        </w:p>
-      </w:tc>
-      <w:tc>
-        <w:tcPr>
-          <w:tcW w:type="dxa" w:w="7200"/>
-          <w:tcBorders>
-            <w:top w:val="none" w:sz="0" w:space="0" w:color="auto"/>
-            <w:left w:val="none" w:sz="0" w:space="0" w:color="auto"/>
-            <w:bottom w:val="none" w:sz="0" w:space="0" w:color="auto"/>
-            <w:right w:val="none" w:sz="0" w:space="0" w:color="auto"/>
-          </w:tcBorders>
-        </w:tcPr>
-        <w:p>
-          <w:pPr>
-            <w:jc w:val="left"/>
-          </w:pPr>
-          <w:r>
-            <w:rPr>
               <w:rFonts w:ascii="Times New Roman" w:hAnsi="Times New Roman"/>
-              <w:b/>
-              <w:color w:val="003D6B"/>
-              <w:sz w:val="16"/>
-            </w:rPr>
-            <w:t>UNIVERSIDADE FEDERAL DO RECÔNCAVO DA BAHIA — UFRB</w:t>
-          </w:r>
-        </w:p>
-        <w:p>
-          <w:pPr>
-            <w:jc w:val="left"/>
-          </w:pPr>
-          <w:r>
-            <w:rPr>
-              <w:rFonts w:ascii="Times New Roman" w:hAnsi="Times New Roman"/>
-              <w:b/>
-              <w:color w:val="006DAA"/>
-              <w:sz w:val="15"/>
-            </w:rPr>
-            <w:t>CENTRO DE CIÊNCIA E TECNOLOGIA — CETENS</w:t>
-          </w:r>
-        </w:p>
-        <w:p>
-          <w:pPr>
-            <w:jc w:val="left"/>
-          </w:pPr>
-          <w:r>
-            <w:rPr>
-              <w:rFonts w:ascii="Times New Roman" w:hAnsi="Times New Roman"/>
-              <w:color w:val="505050"/>
-              <w:sz w:val="14"/>
-            </w:rPr>
-            <w:t>BACHARELADO EM SISTEMAS DE INFORMAÇÃO (EAD)</w:t>
-          </w:r>
-        </w:p>
-        <w:p>
-          <w:pPr>
-            <w:jc w:val="left"/>
-          </w:pPr>
-          <w:r>
-            <w:rPr>
+              <w:b w:val="0"/>
               <w:color w:val="C89B3C"/>
               <w:sz w:val="8"/>
             </w:rPr>

</xml_diff>